<commit_message>
Update file laporan praktikum
</commit_message>
<xml_diff>
--- a/LAPRAK3_IS0802_108052500126_GIZELA CARLA AGUSTYNE TAMENO.docx
+++ b/LAPRAK3_IS0802_108052500126_GIZELA CARLA AGUSTYNE TAMENO.docx
@@ -1006,6 +1006,7 @@
         <w:t xml:space="preserve">. </w:t>
       </w:r>
       <w:proofErr w:type="spellStart"/>
+      <w:proofErr w:type="gramStart"/>
       <w:r>
         <w:rPr>
           <w:noProof w:val="0"/>
@@ -1014,6 +1015,7 @@
         <w:t>document.getElementById</w:t>
       </w:r>
       <w:proofErr w:type="spellEnd"/>
+      <w:proofErr w:type="gramEnd"/>
       <w:r>
         <w:rPr>
           <w:noProof w:val="0"/>
@@ -4572,13 +4574,7 @@
               <w:rPr>
                 <w:lang w:val="en-US"/>
               </w:rPr>
-              <w:t xml:space="preserve">Kode </w:t>
-            </w:r>
-            <w:r>
-              <w:rPr>
-                <w:lang w:val="en-US"/>
-              </w:rPr>
-              <w:t>Javascript 1</w:t>
+              <w:t>Kode Javascript 1</w:t>
             </w:r>
           </w:p>
         </w:tc>
@@ -4671,13 +4667,7 @@
               <w:rPr>
                 <w:lang w:val="en-US"/>
               </w:rPr>
-              <w:t xml:space="preserve">Kode Javascript </w:t>
-            </w:r>
-            <w:r>
-              <w:rPr>
-                <w:lang w:val="en-US"/>
-              </w:rPr>
-              <w:t>2</w:t>
+              <w:t>Kode Javascript 2</w:t>
             </w:r>
           </w:p>
         </w:tc>
@@ -4770,13 +4760,7 @@
               <w:rPr>
                 <w:lang w:val="en-US"/>
               </w:rPr>
-              <w:t xml:space="preserve">Kode Javascript </w:t>
-            </w:r>
-            <w:r>
-              <w:rPr>
-                <w:lang w:val="en-US"/>
-              </w:rPr>
-              <w:t>3</w:t>
+              <w:t>Kode Javascript 3</w:t>
             </w:r>
           </w:p>
         </w:tc>
@@ -5014,14 +4998,7 @@
           <w:b/>
           <w:bCs/>
         </w:rPr>
-        <w:t xml:space="preserve">Output </w:t>
-      </w:r>
-      <w:r>
-        <w:rPr>
-          <w:b/>
-          <w:bCs/>
-        </w:rPr>
-        <w:t>CSS</w:t>
+        <w:t>Output CSS</w:t>
       </w:r>
       <w:r>
         <w:rPr>
@@ -5221,15 +5198,7 @@
           <w:bCs/>
           <w:lang w:val="en-US"/>
         </w:rPr>
-        <w:t xml:space="preserve">Penjelasan </w:t>
-      </w:r>
-      <w:r>
-        <w:rPr>
-          <w:b/>
-          <w:bCs/>
-          <w:lang w:val="en-US"/>
-        </w:rPr>
-        <w:t>CSS</w:t>
+        <w:t>Penjelasan CSS</w:t>
       </w:r>
       <w:r>
         <w:rPr>
@@ -5278,14 +5247,7 @@
           <w:b/>
           <w:bCs/>
         </w:rPr>
-        <w:t xml:space="preserve">Output </w:t>
-      </w:r>
-      <w:r>
-        <w:rPr>
-          <w:b/>
-          <w:bCs/>
-        </w:rPr>
-        <w:t>Javascript</w:t>
+        <w:t>Output Javascript</w:t>
       </w:r>
       <w:r>
         <w:rPr>
@@ -5376,15 +5338,7 @@
           <w:bCs/>
           <w:lang w:val="en-US"/>
         </w:rPr>
-        <w:t xml:space="preserve">Penjelasan </w:t>
-      </w:r>
-      <w:r>
-        <w:rPr>
-          <w:b/>
-          <w:bCs/>
-          <w:lang w:val="en-US"/>
-        </w:rPr>
-        <w:t>Javascript</w:t>
+        <w:t>Penjelasan Javascript</w:t>
       </w:r>
       <w:r>
         <w:rPr>
@@ -6275,13 +6229,7 @@
         <w:rPr>
           <w:lang w:val="en-US"/>
         </w:rPr>
-        <w:t>Bagian ini membahas object bawaan JavaScript. Number untuk mengecek dan memformat angka (isInteger, toPrecision), Math untuk perhitungan (floor, ceil, round, random, pow), String untuk mengolah teks (toLowerCase, toUpperCase), dan Array untuk mengolah data (isArray, length, forEach).</w:t>
-      </w:r>
-      <w:r>
-        <w:rPr>
-          <w:lang w:val="en-US"/>
-        </w:rPr>
-        <w:t xml:space="preserve"> </w:t>
+        <w:t xml:space="preserve">Bagian ini membahas object bawaan JavaScript. Number untuk mengecek dan memformat angka (isInteger, toPrecision), Math untuk perhitungan (floor, ceil, round, random, pow), String untuk mengolah teks (toLowerCase, toUpperCase), dan Array untuk mengolah data (isArray, length, forEach). </w:t>
       </w:r>
     </w:p>
     <w:p>
@@ -7372,27 +7320,35 @@
             <w:rStyle w:val="Hyperlink"/>
             <w:lang w:val="en-US"/>
           </w:rPr>
-          <w:t>https://gizelacarla.github.io/tugas-paw-2/</w:t>
+          <w:t>https://gizelacarla.github.io/tug</w:t>
         </w:r>
-      </w:hyperlink>
-    </w:p>
-    <w:p>
-      <w:pPr>
-        <w:rPr>
-          <w:lang w:val="en-US"/>
-        </w:rPr>
-      </w:pPr>
-      <w:hyperlink r:id="rId55" w:history="1">
         <w:r>
           <w:rPr>
             <w:rStyle w:val="Hyperlink"/>
             <w:lang w:val="en-US"/>
           </w:rPr>
-          <w:t>https://github.com/gizelacarla/tugas-paw-2</w:t>
+          <w:t>a</w:t>
+        </w:r>
+        <w:r>
+          <w:rPr>
+            <w:rStyle w:val="Hyperlink"/>
+            <w:lang w:val="en-US"/>
+          </w:rPr>
+          <w:t>s-paw-3/</w:t>
         </w:r>
       </w:hyperlink>
-    </w:p>
-    <w:p/>
+      <w:hyperlink r:id="rId55" w:history="1"/>
+    </w:p>
+    <w:p>
+      <w:hyperlink r:id="rId56" w:history="1">
+        <w:r>
+          <w:rPr>
+            <w:rStyle w:val="Hyperlink"/>
+          </w:rPr>
+          <w:t>https://github.com/gizelacarla/tugas-paw-3</w:t>
+        </w:r>
+      </w:hyperlink>
+    </w:p>
     <w:sectPr>
       <w:pgSz w:w="11910" w:h="16840"/>
       <w:pgMar w:top="1620" w:right="850" w:bottom="280" w:left="1700" w:header="720" w:footer="720" w:gutter="0"/>
@@ -10603,6 +10559,18 @@
       <w:szCs w:val="20"/>
     </w:rPr>
   </w:style>
+  <w:style w:type="character" w:styleId="FollowedHyperlink">
+    <w:name w:val="FollowedHyperlink"/>
+    <w:basedOn w:val="DefaultParagraphFont"/>
+    <w:uiPriority w:val="99"/>
+    <w:semiHidden/>
+    <w:unhideWhenUsed/>
+    <w:rsid w:val="00D32CF7"/>
+    <w:rPr>
+      <w:color w:val="800080" w:themeColor="followedHyperlink"/>
+      <w:u w:val="single"/>
+    </w:rPr>
+  </w:style>
 </w:styles>
 </file>
 

</xml_diff>